<commit_message>
qa: evidencias y reportes actualizados post-rediseno UI
- 8 tests dashboard + 10 tests mobile = 18/18 REUSSIS
- Videos demo regrabados (dashboard + mobile)
- Screenshots actualizados con nuevo UI
- Fix encoding utf-8 en test_mobile_sync.py
</commit_message>
<xml_diff>
--- a/qa/Reporte_QA_Mobile_MoodIoT.docx
+++ b/qa/Reporte_QA_Mobile_MoodIoT.docx
@@ -39,7 +39,7 @@
         </w:rPr>
         <w:t>Projet Mood-IoT - Fil Rouge Master ADE 2026</w:t>
         <w:br/>
-        <w:t>Date d'execution : 12/04/2026 a 16:15</w:t>
+        <w:t>Date d'execution : 12/04/2026 a 16:37</w:t>
         <w:br/>
         <w:t>Plateforme : Android (Health Connect SDK)</w:t>
         <w:br/>
@@ -713,7 +713,7 @@
         </w:rPr>
         <w:t>=== Verification PostgreSQL — daily_aggregates ===</w:t>
         <w:br/>
-        <w:t>Date d'execution: 2026-04-12T15:15:51.791261</w:t>
+        <w:t>Date d'execution: 2026-04-12T16:35:26.647772</w:t>
         <w:br/>
         <w:t>Patient: c0000000-0000-0000-0000-000000000001 (Sophie Dupont)</w:t>
         <w:br/>
@@ -736,7 +736,7 @@
         <w:br/>
         <w:t>------------+----------------+------------+--------------------+------------------------+-------------------------------</w:t>
         <w:br/>
-        <w:t xml:space="preserve"> 2026-04-12 |             80 |      11566 |                447 | android_health_connect | 2026-04-12 21:15:49.537114+00</w:t>
+        <w:t xml:space="preserve"> 2026-04-12 |             84 |       9798 |                456 | android_health_connect | 2026-04-12 22:35:25.228631+00</w:t>
         <w:br/>
         <w:t xml:space="preserve"> 2026-04-11 |             74 |       9100 |                450 | android_health_connect | 2026-04-12 19:55:13.545441+00</w:t>
         <w:br/>
@@ -744,7 +744,7 @@
         <w:br/>
         <w:t xml:space="preserve"> 2026-04-09 |             68 |       6200 |                390 | android_health_connect | 2026-04-12 19:55:13.457679+00</w:t>
         <w:br/>
-        <w:t xml:space="preserve"> 2026-04-08 |             73 |       8900 |                445 | android_health_connect | 2026-04-12 20:19:59.900564+00</w:t>
+        <w:t xml:space="preserve"> 2026-04-08 |             73 |       8900 |                445 | android_health_connect | 2026-04-12 21:15:52.485605+00</w:t>
         <w:br/>
         <w:t>(5 rows)</w:t>
         <w:br/>
@@ -784,7 +784,7 @@
         <w:br/>
         <w:t xml:space="preserve">  "synced_count": 3,</w:t>
         <w:br/>
-        <w:t xml:space="preserve">  "synced_at": "2026-04-12T21:15:52.495874+00:00",</w:t>
+        <w:t xml:space="preserve">  "synced_at": "2026-04-12T22:35:26.892937+00:00",</w:t>
         <w:br/>
         <w:t xml:space="preserve">  "results": [</w:t>
         <w:br/>
@@ -796,7 +796,7 @@
         <w:br/>
         <w:t xml:space="preserve">      "source_platform": "android_health_connect",</w:t>
         <w:br/>
-        <w:t xml:space="preserve">      "synced_at": "2026-04-12T21:15:52.463511+00:00",</w:t>
+        <w:t xml:space="preserve">      "synced_at": "2026-04-12T22:35:26.875233+00:00",</w:t>
         <w:br/>
         <w:t xml:space="preserve">      "upserted": true</w:t>
         <w:br/>
@@ -810,7 +810,7 @@
         <w:br/>
         <w:t xml:space="preserve">      "source_platform": "android_health_connect",</w:t>
         <w:br/>
-        <w:t xml:space="preserve">      "synced_at": "2026-04-12T21:15:52.476963+00:00",</w:t>
+        <w:t xml:space="preserve">      "synced_at": "2026-04-12T22:35:26.881767+00:00",</w:t>
         <w:br/>
         <w:t xml:space="preserve">      "upserted": true</w:t>
         <w:br/>
@@ -824,7 +824,7 @@
         <w:br/>
         <w:t xml:space="preserve">      "source_platform": "android_health_connect",</w:t>
         <w:br/>
-        <w:t xml:space="preserve">      "synced_at": "2026-04-12T21:15:52.485605+00:00",</w:t>
+        <w:t xml:space="preserve">      "synced_at": "2026-04-12T22:35:26.888710+00:00",</w:t>
         <w:br/>
         <w:t xml:space="preserve">      "upserted": true</w:t>
         <w:br/>
@@ -876,7 +876,7 @@
         </w:rPr>
         <w:t>=== Verification PostgreSQL — Apres Batch Sync ===</w:t>
         <w:br/>
-        <w:t>Date d'execution: 2026-04-12T15:15:54.038800</w:t>
+        <w:t>Date d'execution: 2026-04-12T16:35:28.237115</w:t>
         <w:br/>
         <w:t>Patient: c0000000-0000-0000-0000-000000000001 (Sophie Dupont)</w:t>
         <w:br/>
@@ -907,7 +907,7 @@
         <w:br/>
         <w:t xml:space="preserve"> 2026-04-11 |             74 |       9100 |                450 | android_health_connect</w:t>
         <w:br/>
-        <w:t xml:space="preserve"> 2026-04-12 |             80 |      11566 |                447 | android_health_connect</w:t>
+        <w:t xml:space="preserve"> 2026-04-12 |             84 |       9798 |                456 | android_health_connect</w:t>
         <w:br/>
         <w:t>(7 rows)</w:t>
         <w:br/>
@@ -1522,7 +1522,7 @@
           <w:color w:val="999999"/>
           <w:sz w:val="18"/>
         </w:rPr>
-        <w:t>Rapport genere le 12/04/2026 a 16:15 | Mood-IoT v2.0 | Fil Rouge Master ADE 2026</w:t>
+        <w:t>Rapport genere le 12/04/2026 a 16:37 | Mood-IoT v2.0 | Fil Rouge Master ADE 2026</w:t>
       </w:r>
     </w:p>
     <w:sectPr>

</xml_diff>